<commit_message>
docs: minor changes for user manual
</commit_message>
<xml_diff>
--- a/docs/SNMP Driver - App&Project Engineer - v1.docx
+++ b/docs/SNMP Driver - App&Project Engineer - v1.docx
@@ -58,7 +58,17 @@
         <w:jc w:val="center"/>
       </w:pPr>
       <w:r>
-        <w:t>Ignition Advanced Reporting User Manual (Site Engineer) v1</w:t>
+        <w:t>Ignition</w:t>
+      </w:r>
+      <w:r>
+        <w:rPr>
+          <w:rFonts w:eastAsia="SimSun" w:hint="eastAsia"/>
+          <w:lang w:eastAsia="zh-CN"/>
+        </w:rPr>
+        <w:t xml:space="preserve"> SNMP Driver </w:t>
+      </w:r>
+      <w:r>
+        <w:t>User Manual (Site Engineer) v1</w:t>
       </w:r>
     </w:p>
     <w:p>
@@ -68,7 +78,24 @@
         <w:jc w:val="center"/>
       </w:pPr>
       <w:r>
-        <w:t>EEPL-UM-Ignition Advanced Reportung-v1</w:t>
+        <w:t>EEPL-UM-Ignition</w:t>
+      </w:r>
+      <w:r>
+        <w:rPr>
+          <w:rFonts w:eastAsia="SimSun" w:hint="eastAsia"/>
+          <w:lang w:eastAsia="zh-CN"/>
+        </w:rPr>
+        <w:t xml:space="preserve"> SNMP</w:t>
+      </w:r>
+      <w:r>
+        <w:rPr>
+          <w:rFonts w:eastAsia="SimSun"/>
+          <w:lang w:val="en-SG" w:eastAsia="zh-CN"/>
+        </w:rPr>
+        <w:t xml:space="preserve"> Driver</w:t>
+      </w:r>
+      <w:r>
+        <w:t>-v1</w:t>
       </w:r>
     </w:p>
     <w:p>
@@ -150,10 +177,7 @@
         </w:pBdr>
       </w:pPr>
       <w:r>
-        <w:t>App &amp; Project</w:t>
-      </w:r>
-      <w:r>
-        <w:t xml:space="preserve"> Engineers</w:t>
+        <w:t>App &amp; Project Engineers</w:t>
       </w:r>
       <w:r>
         <w:t xml:space="preserve"> Manual</w:t>

</xml_diff>